<commit_message>
report 10 table coloring
27/7/2026 22:30
</commit_message>
<xml_diff>
--- a/z reports/CHY report w10 - pynq.docx
+++ b/z reports/CHY report w10 - pynq.docx
@@ -4058,16 +4058,7 @@
     <w:p/>
     <w:p>
       <w:r>
-        <w:t>Table 1.7</w:t>
-      </w:r>
-      <w:r>
-        <w:t xml:space="preserve"> and Table 1.8</w:t>
-      </w:r>
-      <w:r>
-        <w:t xml:space="preserve"> </w:t>
-      </w:r>
-      <w:r>
-        <w:t xml:space="preserve">show </w:t>
+        <w:t xml:space="preserve">Table 1.7 and Table 1.8 show </w:t>
       </w:r>
       <w:r>
         <w:t xml:space="preserve">that snow-specific training produces a large </w:t>
@@ -5542,6 +5533,7 @@
         <w:tc>
           <w:tcPr>
             <w:tcW w:w="0" w:type="auto"/>
+            <w:shd w:val="clear" w:color="auto" w:fill="FFF2CC" w:themeFill="accent4" w:themeFillTint="33"/>
             <w:hideMark/>
           </w:tcPr>
           <w:p>
@@ -5553,6 +5545,7 @@
         <w:tc>
           <w:tcPr>
             <w:tcW w:w="0" w:type="auto"/>
+            <w:shd w:val="clear" w:color="auto" w:fill="FFF2CC" w:themeFill="accent4" w:themeFillTint="33"/>
             <w:hideMark/>
           </w:tcPr>
           <w:p>
@@ -5564,6 +5557,7 @@
         <w:tc>
           <w:tcPr>
             <w:tcW w:w="0" w:type="auto"/>
+            <w:shd w:val="clear" w:color="auto" w:fill="FFF2CC" w:themeFill="accent4" w:themeFillTint="33"/>
             <w:hideMark/>
           </w:tcPr>
           <w:p>
@@ -5688,33 +5682,112 @@
         <w:tc>
           <w:tcPr>
             <w:tcW w:w="0" w:type="auto"/>
-            <w:hideMark/>
-          </w:tcPr>
-          <w:p>
-            <w:r>
-              <w:t>Parameter reduction</w:t>
-            </w:r>
-          </w:p>
-        </w:tc>
-        <w:tc>
-          <w:tcPr>
-            <w:tcW w:w="0" w:type="auto"/>
-            <w:hideMark/>
-          </w:tcPr>
-          <w:p>
-            <w:r>
-              <w:t>No</w:t>
-            </w:r>
-          </w:p>
-        </w:tc>
-        <w:tc>
-          <w:tcPr>
-            <w:tcW w:w="0" w:type="auto"/>
-            <w:hideMark/>
-          </w:tcPr>
-          <w:p>
-            <w:r>
-              <w:t>Yes</w:t>
+            <w:shd w:val="clear" w:color="auto" w:fill="FBE4D5" w:themeFill="accent2" w:themeFillTint="33"/>
+            <w:hideMark/>
+          </w:tcPr>
+          <w:p>
+            <w:r>
+              <w:t>Accuracy</w:t>
+            </w:r>
+          </w:p>
+        </w:tc>
+        <w:tc>
+          <w:tcPr>
+            <w:tcW w:w="0" w:type="auto"/>
+            <w:shd w:val="clear" w:color="auto" w:fill="FBE4D5" w:themeFill="accent2" w:themeFillTint="33"/>
+            <w:hideMark/>
+          </w:tcPr>
+          <w:p>
+            <w:r>
+              <w:t>Better</w:t>
+            </w:r>
+          </w:p>
+        </w:tc>
+        <w:tc>
+          <w:tcPr>
+            <w:tcW w:w="0" w:type="auto"/>
+            <w:shd w:val="clear" w:color="auto" w:fill="FBE4D5" w:themeFill="accent2" w:themeFillTint="33"/>
+            <w:hideMark/>
+          </w:tcPr>
+          <w:p>
+            <w:r>
+              <w:t>Lower</w:t>
+            </w:r>
+          </w:p>
+        </w:tc>
+      </w:tr>
+      <w:tr>
+        <w:trPr>
+          <w:jc w:val="center"/>
+        </w:trPr>
+        <w:tc>
+          <w:tcPr>
+            <w:tcW w:w="0" w:type="auto"/>
+            <w:shd w:val="clear" w:color="auto" w:fill="E2EFD9" w:themeFill="accent6" w:themeFillTint="33"/>
+          </w:tcPr>
+          <w:p>
+            <w:r>
+              <w:t>Model size</w:t>
+            </w:r>
+          </w:p>
+        </w:tc>
+        <w:tc>
+          <w:tcPr>
+            <w:tcW w:w="0" w:type="auto"/>
+            <w:shd w:val="clear" w:color="auto" w:fill="E2EFD9" w:themeFill="accent6" w:themeFillTint="33"/>
+          </w:tcPr>
+          <w:p>
+            <w:r>
+              <w:t>Bigger</w:t>
+            </w:r>
+          </w:p>
+        </w:tc>
+        <w:tc>
+          <w:tcPr>
+            <w:tcW w:w="0" w:type="auto"/>
+            <w:shd w:val="clear" w:color="auto" w:fill="E2EFD9" w:themeFill="accent6" w:themeFillTint="33"/>
+          </w:tcPr>
+          <w:p>
+            <w:r>
+              <w:t>Smaller</w:t>
+            </w:r>
+          </w:p>
+        </w:tc>
+      </w:tr>
+      <w:tr>
+        <w:trPr>
+          <w:jc w:val="center"/>
+        </w:trPr>
+        <w:tc>
+          <w:tcPr>
+            <w:tcW w:w="0" w:type="auto"/>
+            <w:shd w:val="clear" w:color="auto" w:fill="E2EFD9" w:themeFill="accent6" w:themeFillTint="33"/>
+          </w:tcPr>
+          <w:p>
+            <w:r>
+              <w:t>Model speed</w:t>
+            </w:r>
+          </w:p>
+        </w:tc>
+        <w:tc>
+          <w:tcPr>
+            <w:tcW w:w="0" w:type="auto"/>
+            <w:shd w:val="clear" w:color="auto" w:fill="E2EFD9" w:themeFill="accent6" w:themeFillTint="33"/>
+          </w:tcPr>
+          <w:p>
+            <w:r>
+              <w:t>Slower</w:t>
+            </w:r>
+          </w:p>
+        </w:tc>
+        <w:tc>
+          <w:tcPr>
+            <w:tcW w:w="0" w:type="auto"/>
+            <w:shd w:val="clear" w:color="auto" w:fill="E2EFD9" w:themeFill="accent6" w:themeFillTint="33"/>
+          </w:tcPr>
+          <w:p>
+            <w:r>
+              <w:t>Faster</w:t>
             </w:r>
           </w:p>
         </w:tc>
@@ -8060,16 +8133,7 @@
           <w:sz w:val="32"/>
           <w:szCs w:val="28"/>
         </w:rPr>
-        <w:t xml:space="preserve">3.2 </w:t>
-      </w:r>
-      <w:r>
-        <w:rPr>
-          <w:b/>
-          <w:bCs/>
-          <w:sz w:val="32"/>
-          <w:szCs w:val="28"/>
-        </w:rPr>
-        <w:t>Global L1 channel-magnitude structured pruning</w:t>
+        <w:t>3.2 Global L1 channel-magnitude structured pruning</w:t>
       </w:r>
     </w:p>
     <w:p/>
@@ -9800,6 +9864,7 @@
   <w:style w:type="character" w:default="1" w:styleId="DefaultParagraphFont">
     <w:name w:val="Default Paragraph Font"/>
     <w:uiPriority w:val="1"/>
+    <w:semiHidden/>
     <w:unhideWhenUsed/>
   </w:style>
   <w:style w:type="table" w:default="1" w:styleId="TableNormal">

</xml_diff>